<commit_message>
docs: update manuscript, ethics statement, and supplementary materials
</commit_message>
<xml_diff>
--- a/ETHICS_STATEMENT_2.docx
+++ b/ETHICS_STATEMENT_2.docx
@@ -7,175 +7,175 @@
         <w:spacing w:after="240"/>
         <w:jc w:val="center"/>
       </w:pPr>
+      <w:r>
+        <w:rPr>
+          <w:rFonts w:ascii="Calibri" w:eastAsia="Calibri" w:hAnsi="Calibri" w:cs="Calibri"/>
+          <w:b/>
+          <w:bCs/>
+          <w:sz w:val="28"/>
+          <w:szCs w:val="28"/>
+        </w:rPr>
+        <w:t>Institutional Ethics &amp; Participant Consent Statement</w:t>
+      </w:r>
+    </w:p>
+    <w:p>
+      <w:pPr>
+        <w:spacing w:after="160"/>
+      </w:pPr>
+      <w:r>
+        <w:rPr>
+          <w:rFonts w:ascii="Calibri" w:eastAsia="Calibri" w:hAnsi="Calibri" w:cs="Calibri"/>
+          <w:b/>
+          <w:bCs/>
+          <w:sz w:val="22"/>
+          <w:szCs w:val="22"/>
+        </w:rPr>
+        <w:t xml:space="preserve">Study: </w:t>
+      </w:r>
+      <w:r>
+        <w:rPr>
+          <w:rFonts w:ascii="Calibri" w:eastAsia="Calibri" w:hAnsi="Calibri" w:cs="Calibri"/>
+          <w:i/>
+          <w:iCs/>
+          <w:sz w:val="22"/>
+          <w:szCs w:val="22"/>
+        </w:rPr>
+        <w:t>Explainable machine learning for student burnout classification and risk stratification: mixed-methods study with qualitative triangulation</w:t>
+      </w:r>
+    </w:p>
+    <w:p>
+      <w:pPr>
+        <w:spacing w:after="160"/>
+      </w:pPr>
+      <w:r>
+        <w:rPr>
+          <w:rFonts w:ascii="Calibri" w:eastAsia="Calibri" w:hAnsi="Calibri" w:cs="Calibri"/>
+          <w:b/>
+          <w:bCs/>
+          <w:sz w:val="22"/>
+          <w:szCs w:val="22"/>
+        </w:rPr>
+        <w:t xml:space="preserve">Corresponding Author: </w:t>
+      </w:r>
+      <w:r>
+        <w:rPr>
+          <w:rFonts w:ascii="Calibri" w:eastAsia="Calibri" w:hAnsi="Calibri" w:cs="Calibri"/>
+          <w:sz w:val="22"/>
+          <w:szCs w:val="22"/>
+        </w:rPr>
+        <w:t>Rifat Miah (Email: rifatmiah1992003@gmail.com)</w:t>
+      </w:r>
+    </w:p>
+    <w:p>
+      <w:pPr>
+        <w:spacing w:after="160"/>
+      </w:pPr>
+      <w:r>
+        <w:rPr>
+          <w:rFonts w:ascii="Calibri" w:eastAsia="Calibri" w:hAnsi="Calibri" w:cs="Calibri"/>
+          <w:b/>
+          <w:bCs/>
+          <w:sz w:val="22"/>
+          <w:szCs w:val="22"/>
+        </w:rPr>
+        <w:t xml:space="preserve">Co-Author / Research Supervisor: </w:t>
+      </w:r>
+      <w:proofErr w:type="spellStart"/>
+      <w:r>
+        <w:rPr>
+          <w:rFonts w:ascii="Calibri" w:eastAsia="Calibri" w:hAnsi="Calibri" w:cs="Calibri"/>
+          <w:sz w:val="22"/>
+          <w:szCs w:val="22"/>
+        </w:rPr>
+        <w:t>Dr.</w:t>
+      </w:r>
+      <w:proofErr w:type="spellEnd"/>
+      <w:r>
+        <w:rPr>
+          <w:rFonts w:ascii="Calibri" w:eastAsia="Calibri" w:hAnsi="Calibri" w:cs="Calibri"/>
+          <w:sz w:val="22"/>
+          <w:szCs w:val="22"/>
+        </w:rPr>
+        <w:t xml:space="preserve"> A.S.M. </w:t>
+      </w:r>
+      <w:proofErr w:type="spellStart"/>
+      <w:r>
+        <w:rPr>
+          <w:rFonts w:ascii="Calibri" w:eastAsia="Calibri" w:hAnsi="Calibri" w:cs="Calibri"/>
+          <w:sz w:val="22"/>
+          <w:szCs w:val="22"/>
+        </w:rPr>
+        <w:t>Shihavuddin</w:t>
+      </w:r>
+      <w:proofErr w:type="spellEnd"/>
+      <w:r>
+        <w:rPr>
+          <w:rFonts w:ascii="Calibri" w:eastAsia="Calibri" w:hAnsi="Calibri" w:cs="Calibri"/>
+          <w:sz w:val="22"/>
+          <w:szCs w:val="22"/>
+        </w:rPr>
+        <w:t xml:space="preserve"> (Email: shihav@eee.green.edu.bd)</w:t>
+      </w:r>
+    </w:p>
+    <w:p>
+      <w:pPr>
+        <w:spacing w:after="220"/>
+      </w:pPr>
+      <w:r>
+        <w:rPr>
+          <w:rFonts w:ascii="Calibri" w:eastAsia="Calibri" w:hAnsi="Calibri" w:cs="Calibri"/>
+          <w:b/>
+          <w:bCs/>
+          <w:sz w:val="22"/>
+          <w:szCs w:val="22"/>
+        </w:rPr>
+        <w:t xml:space="preserve">Affiliation: </w:t>
+      </w:r>
+      <w:r>
+        <w:rPr>
+          <w:rFonts w:ascii="Calibri" w:eastAsia="Calibri" w:hAnsi="Calibri" w:cs="Calibri"/>
+          <w:sz w:val="22"/>
+          <w:szCs w:val="22"/>
+        </w:rPr>
+        <w:t>Department of Computer Science and Engineering, Presidency University, Dhaka-1212, Bangladesh (University Mail: info@pu.edu.bd)</w:t>
+      </w:r>
+    </w:p>
+    <w:p>
+      <w:pPr>
+        <w:spacing w:before="300" w:after="140"/>
+      </w:pPr>
+      <w:r>
+        <w:rPr>
+          <w:rFonts w:ascii="Calibri" w:eastAsia="Calibri" w:hAnsi="Calibri" w:cs="Calibri"/>
+          <w:b/>
+          <w:bCs/>
+          <w:sz w:val="24"/>
+          <w:szCs w:val="24"/>
+        </w:rPr>
+        <w:t>1. Ethical standards and study setting</w:t>
+      </w:r>
+    </w:p>
+    <w:p>
+      <w:pPr>
+        <w:spacing w:after="140"/>
+      </w:pPr>
+      <w:r>
+        <w:rPr>
+          <w:rFonts w:ascii="Calibri" w:eastAsia="Calibri" w:hAnsi="Calibri" w:cs="Calibri"/>
+          <w:sz w:val="22"/>
+          <w:szCs w:val="22"/>
+        </w:rPr>
+        <w:t xml:space="preserve">This study was performed </w:t>
+      </w:r>
       <w:bookmarkStart w:id="0" w:name="_GoBack"/>
       <w:bookmarkEnd w:id="0"/>
       <w:r>
         <w:rPr>
           <w:rFonts w:ascii="Calibri" w:eastAsia="Calibri" w:hAnsi="Calibri" w:cs="Calibri"/>
-          <w:b/>
-          <w:bCs/>
-          <w:sz w:val="28"/>
-          <w:szCs w:val="28"/>
-        </w:rPr>
-        <w:t>Institutional Ethics &amp; Participant Consent Statement</w:t>
-      </w:r>
-    </w:p>
-    <w:p>
-      <w:pPr>
-        <w:spacing w:after="160"/>
-      </w:pPr>
-      <w:r>
-        <w:rPr>
-          <w:rFonts w:ascii="Calibri" w:eastAsia="Calibri" w:hAnsi="Calibri" w:cs="Calibri"/>
-          <w:b/>
-          <w:bCs/>
-          <w:sz w:val="22"/>
-          <w:szCs w:val="22"/>
-        </w:rPr>
-        <w:t xml:space="preserve">Study: </w:t>
-      </w:r>
-      <w:r>
-        <w:rPr>
-          <w:rFonts w:ascii="Calibri" w:eastAsia="Calibri" w:hAnsi="Calibri" w:cs="Calibri"/>
-          <w:i/>
-          <w:iCs/>
-          <w:sz w:val="22"/>
-          <w:szCs w:val="22"/>
-        </w:rPr>
-        <w:t>Explainable machine learning for student burnout classification and risk stratification: mixed-methods study with qualitative triangulation</w:t>
-      </w:r>
-    </w:p>
-    <w:p>
-      <w:pPr>
-        <w:spacing w:after="160"/>
-      </w:pPr>
-      <w:r>
-        <w:rPr>
-          <w:rFonts w:ascii="Calibri" w:eastAsia="Calibri" w:hAnsi="Calibri" w:cs="Calibri"/>
-          <w:b/>
-          <w:bCs/>
-          <w:sz w:val="22"/>
-          <w:szCs w:val="22"/>
-        </w:rPr>
-        <w:t xml:space="preserve">Corresponding Author: </w:t>
-      </w:r>
-      <w:r>
-        <w:rPr>
-          <w:rFonts w:ascii="Calibri" w:eastAsia="Calibri" w:hAnsi="Calibri" w:cs="Calibri"/>
-          <w:sz w:val="22"/>
-          <w:szCs w:val="22"/>
-        </w:rPr>
-        <w:t>Rifat Miah (Email: rifatmiah1992003@gmail.com)</w:t>
-      </w:r>
-    </w:p>
-    <w:p>
-      <w:pPr>
-        <w:spacing w:after="160"/>
-      </w:pPr>
-      <w:r>
-        <w:rPr>
-          <w:rFonts w:ascii="Calibri" w:eastAsia="Calibri" w:hAnsi="Calibri" w:cs="Calibri"/>
-          <w:b/>
-          <w:bCs/>
-          <w:sz w:val="22"/>
-          <w:szCs w:val="22"/>
-        </w:rPr>
-        <w:t xml:space="preserve">Co-Author / Research Supervisor: </w:t>
-      </w:r>
-      <w:proofErr w:type="spellStart"/>
-      <w:r>
-        <w:rPr>
-          <w:rFonts w:ascii="Calibri" w:eastAsia="Calibri" w:hAnsi="Calibri" w:cs="Calibri"/>
-          <w:sz w:val="22"/>
-          <w:szCs w:val="22"/>
-        </w:rPr>
-        <w:t>Dr.</w:t>
-      </w:r>
-      <w:proofErr w:type="spellEnd"/>
-      <w:r>
-        <w:rPr>
-          <w:rFonts w:ascii="Calibri" w:eastAsia="Calibri" w:hAnsi="Calibri" w:cs="Calibri"/>
-          <w:sz w:val="22"/>
-          <w:szCs w:val="22"/>
-        </w:rPr>
-        <w:t xml:space="preserve"> A.S.M. </w:t>
-      </w:r>
-      <w:proofErr w:type="spellStart"/>
-      <w:r>
-        <w:rPr>
-          <w:rFonts w:ascii="Calibri" w:eastAsia="Calibri" w:hAnsi="Calibri" w:cs="Calibri"/>
-          <w:sz w:val="22"/>
-          <w:szCs w:val="22"/>
-        </w:rPr>
-        <w:t>Shihavuddin</w:t>
-      </w:r>
-      <w:proofErr w:type="spellEnd"/>
-      <w:r>
-        <w:rPr>
-          <w:rFonts w:ascii="Calibri" w:eastAsia="Calibri" w:hAnsi="Calibri" w:cs="Calibri"/>
-          <w:sz w:val="22"/>
-          <w:szCs w:val="22"/>
-        </w:rPr>
-        <w:t xml:space="preserve"> (Email: shihav@eee.green.edu.bd)</w:t>
-      </w:r>
-    </w:p>
-    <w:p>
-      <w:pPr>
-        <w:spacing w:after="220"/>
-      </w:pPr>
-      <w:r>
-        <w:rPr>
-          <w:rFonts w:ascii="Calibri" w:eastAsia="Calibri" w:hAnsi="Calibri" w:cs="Calibri"/>
-          <w:b/>
-          <w:bCs/>
-          <w:sz w:val="22"/>
-          <w:szCs w:val="22"/>
-        </w:rPr>
-        <w:t xml:space="preserve">Affiliation: </w:t>
-      </w:r>
-      <w:r>
-        <w:rPr>
-          <w:rFonts w:ascii="Calibri" w:eastAsia="Calibri" w:hAnsi="Calibri" w:cs="Calibri"/>
-          <w:sz w:val="22"/>
-          <w:szCs w:val="22"/>
-        </w:rPr>
-        <w:t>Department of Computer Science and Engineering, Presidency University, Dhaka-1212, Bangladesh (University M</w:t>
-      </w:r>
-      <w:r>
-        <w:rPr>
-          <w:rFonts w:ascii="Calibri" w:eastAsia="Calibri" w:hAnsi="Calibri" w:cs="Calibri"/>
-          <w:sz w:val="22"/>
-          <w:szCs w:val="22"/>
-        </w:rPr>
-        <w:t>ail: info@pu.edu.bd)</w:t>
-      </w:r>
-    </w:p>
-    <w:p>
-      <w:pPr>
-        <w:spacing w:before="300" w:after="140"/>
-      </w:pPr>
-      <w:r>
-        <w:rPr>
-          <w:rFonts w:ascii="Calibri" w:eastAsia="Calibri" w:hAnsi="Calibri" w:cs="Calibri"/>
-          <w:b/>
-          <w:bCs/>
-          <w:sz w:val="24"/>
-          <w:szCs w:val="24"/>
-        </w:rPr>
-        <w:t>1. Ethical standards and study setting</w:t>
-      </w:r>
-    </w:p>
-    <w:p>
-      <w:pPr>
-        <w:spacing w:after="140"/>
-      </w:pPr>
-      <w:r>
-        <w:rPr>
-          <w:rFonts w:ascii="Calibri" w:eastAsia="Calibri" w:hAnsi="Calibri" w:cs="Calibri"/>
-          <w:sz w:val="22"/>
-          <w:szCs w:val="22"/>
-        </w:rPr>
-        <w:t>This study was performed in accordance with the ethical principles of the Declaration of Helsinki for research with human participants.</w:t>
+          <w:sz w:val="22"/>
+          <w:szCs w:val="22"/>
+        </w:rPr>
+        <w:t>in accordance with the ethical principles of the Declaration of Helsinki for research with human participants.</w:t>
       </w:r>
     </w:p>
     <w:p>
@@ -203,15 +203,7 @@
           <w:sz w:val="22"/>
           <w:szCs w:val="22"/>
         </w:rPr>
-        <w:t>Minimal risk observational cross-sectional sur</w:t>
-      </w:r>
-      <w:r>
-        <w:rPr>
-          <w:rFonts w:ascii="Calibri" w:eastAsia="Calibri" w:hAnsi="Calibri" w:cs="Calibri"/>
-          <w:sz w:val="22"/>
-          <w:szCs w:val="22"/>
-        </w:rPr>
-        <w:t>vey (N = 601) and voluntary semi-structured qualitative interviews (N = 20).</w:t>
+        <w:t>Minimal risk observational cross-sectional survey (N = 601) and voluntary semi-structured qualitative interviews (N = 20).</w:t>
       </w:r>
     </w:p>
     <w:p>
@@ -222,6 +214,11 @@
           <w:numId w:val="1"/>
         </w:numPr>
         <w:spacing w:after="100"/>
+        <w:rPr>
+          <w:color w:val="0D0D0D" w:themeColor="text1" w:themeTint="F2"/>
+          <w:sz w:val="22"/>
+          <w:szCs w:val="22"/>
+        </w:rPr>
       </w:pPr>
       <w:r>
         <w:rPr>
@@ -235,11 +232,12 @@
       </w:r>
       <w:r>
         <w:rPr>
-          <w:rFonts w:ascii="Calibri" w:eastAsia="Calibri" w:hAnsi="Calibri" w:cs="Calibri"/>
-          <w:sz w:val="22"/>
-          <w:szCs w:val="22"/>
-        </w:rPr>
-        <w:t>Quantitative survey — June 2026, completed; Qualitative interviews — June–July 2026, conducted.</w:t>
+          <w:rFonts w:ascii="Cambria" w:hAnsi="Cambria" w:cs="Courier New"/>
+          <w:color w:val="0D0D0D" w:themeColor="text1" w:themeTint="F2"/>
+          <w:sz w:val="22"/>
+          <w:szCs w:val="22"/>
+        </w:rPr>
+        <w:t>Quantitative survey — March–May 2026, completed; Qualitative interviews — June–July 2026, conducted.</w:t>
       </w:r>
     </w:p>
     <w:p>
@@ -267,15 +265,7 @@
           <w:sz w:val="22"/>
           <w:szCs w:val="22"/>
         </w:rPr>
-        <w:t>University students studying in Banglade</w:t>
-      </w:r>
-      <w:r>
-        <w:rPr>
-          <w:rFonts w:ascii="Calibri" w:eastAsia="Calibri" w:hAnsi="Calibri" w:cs="Calibri"/>
-          <w:sz w:val="22"/>
-          <w:szCs w:val="22"/>
-        </w:rPr>
-        <w:t>sh from 11 universities (8 private universities, 1 public university, 2 National University affiliated colleges). All participants were confirmed to be adult enrolled university students (18+ years).</w:t>
+        <w:t>University students studying in Bangladesh from 11 universities (8 private universities, 1 public university, 2 National University affiliated colleges). All participants were confirmed to be adult enrolled university students (18+ years).</w:t>
       </w:r>
     </w:p>
     <w:p>
@@ -303,15 +293,7 @@
           <w:sz w:val="22"/>
           <w:szCs w:val="22"/>
         </w:rPr>
-        <w:t>The study was deemed exempt fro</w:t>
-      </w:r>
-      <w:r>
-        <w:rPr>
-          <w:rFonts w:ascii="Calibri" w:eastAsia="Calibri" w:hAnsi="Calibri" w:cs="Calibri"/>
-          <w:sz w:val="22"/>
-          <w:szCs w:val="22"/>
-        </w:rPr>
-        <w:t>m formal ethics committee review in accordance with the criteria for low risk, non-interventional, observational educational research. Ethics oversight: Department of Computer Science and Engineering, Presidency University, Dhaka-1212, Bangladesh.</w:t>
+        <w:t>The study was deemed exempt from formal ethics committee review in accordance with the criteria for low risk, non-interventional, observational educational research. Ethics oversight: Department of Computer Science and Engineering, Presidency University, Dhaka-1212, Bangladesh.</w:t>
       </w:r>
     </w:p>
     <w:p>
@@ -324,15 +306,7 @@
           <w:sz w:val="22"/>
           <w:szCs w:val="22"/>
         </w:rPr>
-        <w:t>Requests</w:t>
-      </w:r>
-      <w:r>
-        <w:rPr>
-          <w:rFonts w:ascii="Calibri" w:eastAsia="Calibri" w:hAnsi="Calibri" w:cs="Calibri"/>
-          <w:sz w:val="22"/>
-          <w:szCs w:val="22"/>
-        </w:rPr>
-        <w:t xml:space="preserve"> for ethics exemption documentation should be directed to the corresponding author, rifatmiah1992003@gmail.com.</w:t>
+        <w:t>Requests for ethics exemption documentation should be directed to the corresponding author, rifatmiah1992003@gmail.com.</w:t>
       </w:r>
     </w:p>
     <w:p>
@@ -380,15 +354,7 @@
           <w:sz w:val="22"/>
           <w:szCs w:val="22"/>
         </w:rPr>
-        <w:t>Before filling out the survey instrument through Google Forms, all particip</w:t>
-      </w:r>
-      <w:r>
-        <w:rPr>
-          <w:rFonts w:ascii="Calibri" w:eastAsia="Calibri" w:hAnsi="Calibri" w:cs="Calibri"/>
-          <w:sz w:val="22"/>
-          <w:szCs w:val="22"/>
-        </w:rPr>
-        <w:t>ants were given an electronic Informed Consent Form which included the following information:</w:t>
+        <w:t>Before filling out the survey instrument through Google Forms, all participants were given an electronic Informed Consent Form which included the following information:</w:t>
       </w:r>
     </w:p>
     <w:p>
@@ -430,15 +396,7 @@
           <w:sz w:val="22"/>
           <w:szCs w:val="22"/>
         </w:rPr>
-        <w:t>3</w:t>
-      </w:r>
-      <w:r>
-        <w:rPr>
-          <w:rFonts w:ascii="Calibri" w:eastAsia="Calibri" w:hAnsi="Calibri" w:cs="Calibri"/>
-          <w:sz w:val="22"/>
-          <w:szCs w:val="22"/>
-        </w:rPr>
-        <w:t>. De-identification is to ensure full confidentiality.</w:t>
+        <w:t>3. De-identification is to ensure full confidentiality.</w:t>
       </w:r>
     </w:p>
     <w:p>
@@ -544,15 +502,7 @@
           <w:szCs w:val="22"/>
         </w:rPr>
         <w:lastRenderedPageBreak/>
-        <w:t>All participants were info</w:t>
-      </w:r>
-      <w:r>
-        <w:rPr>
-          <w:rFonts w:ascii="Calibri" w:eastAsia="Calibri" w:hAnsi="Calibri" w:cs="Calibri"/>
-          <w:sz w:val="22"/>
-          <w:szCs w:val="22"/>
-        </w:rPr>
-        <w:t>rmed of the right to withdraw at any time with no penalty to their academic standing.</w:t>
+        <w:t>All participants were informed of the right to withdraw at any time with no penalty to their academic standing.</w:t>
       </w:r>
     </w:p>
     <w:p>
@@ -621,15 +571,7 @@
           <w:sz w:val="22"/>
           <w:szCs w:val="22"/>
         </w:rPr>
-        <w:t>All primary survey responses were fully de-ide</w:t>
-      </w:r>
-      <w:r>
-        <w:rPr>
-          <w:rFonts w:ascii="Calibri" w:eastAsia="Calibri" w:hAnsi="Calibri" w:cs="Calibri"/>
-          <w:sz w:val="22"/>
-          <w:szCs w:val="22"/>
-        </w:rPr>
-        <w:t>ntified (</w:t>
+        <w:t>All primary survey responses were fully de-identified (</w:t>
       </w:r>
       <w:r>
         <w:rPr>
@@ -693,15 +635,7 @@
           <w:sz w:val="22"/>
           <w:szCs w:val="22"/>
         </w:rPr>
-        <w:t xml:space="preserve"> in public repositories are fully anonymized, comply</w:t>
-      </w:r>
-      <w:r>
-        <w:rPr>
-          <w:rFonts w:ascii="Calibri" w:eastAsia="Calibri" w:hAnsi="Calibri" w:cs="Calibri"/>
-          <w:sz w:val="22"/>
-          <w:szCs w:val="22"/>
-        </w:rPr>
-        <w:t>ing with open science and data privacy standards.</w:t>
+        <w:t xml:space="preserve"> in public repositories are fully anonymized, complying with open science and data privacy standards.</w:t>
       </w:r>
     </w:p>
     <w:p>
@@ -769,15 +703,7 @@
           <w:sz w:val="22"/>
           <w:szCs w:val="22"/>
         </w:rPr>
-        <w:t>This document is issued along with the manuscript submission from Department of Compu</w:t>
-      </w:r>
-      <w:r>
-        <w:rPr>
-          <w:rFonts w:ascii="Calibri" w:eastAsia="Calibri" w:hAnsi="Calibri" w:cs="Calibri"/>
-          <w:sz w:val="22"/>
-          <w:szCs w:val="22"/>
-        </w:rPr>
-        <w:t>ter Science and Engineering, Presidency University, Dhaka-1212, Bangladesh.</w:t>
+        <w:t>This document is issued along with the manuscript submission from Department of Computer Science and Engineering, Presidency University, Dhaka-1212, Bangladesh.</w:t>
       </w:r>
     </w:p>
     <w:p>
@@ -874,15 +800,7 @@
           <w:sz w:val="22"/>
           <w:szCs w:val="22"/>
         </w:rPr>
-        <w:t>Departme</w:t>
-      </w:r>
-      <w:r>
-        <w:rPr>
-          <w:rFonts w:ascii="Calibri" w:eastAsia="Calibri" w:hAnsi="Calibri" w:cs="Calibri"/>
-          <w:sz w:val="22"/>
-          <w:szCs w:val="22"/>
-        </w:rPr>
-        <w:t>nt of CSE, Presidency University, Plot 2/A, Road 92, Gulshan-2, Dhaka-1212, Bangladesh</w:t>
+        <w:t>Department of CSE, Presidency University, Plot 2/A, Road 92, Gulshan-2, Dhaka-1212, Bangladesh</w:t>
       </w:r>
     </w:p>
     <w:sectPr>

</xml_diff>